<commit_message>
Refresh V28R1 diagnostics and source proof package
</commit_message>
<xml_diff>
--- a/QA_EVIDENCE/V28R1/DOCX_FIXTURES/arabic-report.docx
+++ b/QA_EVIDENCE/V28R1/DOCX_FIXTURES/arabic-report.docx
@@ -45,7 +45,7 @@
           <w:rFonts w:ascii="Aptos" w:hAnsi="Aptos" w:cs="Arial"/>
           <w:lang w:val="en-US" w:bidi="en-US"/>
         </w:rPr>
-        <w:t xml:space="preserve">Cached report fixture</w:t>
+        <w:t xml:space="preserve">Technical Review</w:t>
       </w:r>
     </w:p>
     <w:tbl>
@@ -94,7 +94,7 @@
                 <w:color w:val="667085"/>
                 <w:lang w:val="en-US" w:bidi="en-US"/>
               </w:rPr>
-              <w:t xml:space="preserve">2026-10-05</w:t>
+              <w:t xml:space="preserve">2026-10-04</w:t>
             </w:r>
           </w:p>
         </w:tc>
@@ -124,7 +124,7 @@
                 <w:color w:val="667085"/>
                 <w:lang w:val="en-US" w:bidi="en-US"/>
               </w:rPr>
-              <w:t xml:space="preserve">09:00</w:t>
+              <w:t xml:space="preserve">09:30</w:t>
             </w:r>
           </w:p>
         </w:tc>
@@ -154,7 +154,7 @@
                 <w:color w:val="667085"/>
                 <w:lang w:val="en-US" w:bidi="en-US"/>
               </w:rPr>
-              <w:t xml:space="preserve">00:02:00</w:t>
+              <w:t xml:space="preserve">00:10:00</w:t>
             </w:r>
           </w:p>
         </w:tc>
@@ -256,7 +256,7 @@
                 <w:rtl/>
                 <w:lang w:val="ar-SA" w:bidi="ar-SA"/>
               </w:rPr>
-              <w:t xml:space="preserve">تمت مراجعة </w:t>
+              <w:t xml:space="preserve">تم الاتفاق على مراجعة </w:t>
             </w:r>
             <w:r>
               <w:rPr>
@@ -271,7 +271,29 @@
                 <w:rtl/>
                 <w:lang w:val="ar-SA" w:bidi="ar-SA"/>
               </w:rPr>
-              <w:t xml:space="preserve">ضمن الخطة.</w:t>
+              <w:t xml:space="preserve">ونظام </w:t>
+            </w:r>
+            <w:r>
+              <w:rPr>
+                <w:rFonts w:ascii="Aptos" w:hAnsi="Aptos" w:cs="Arial"/>
+                <w:lang w:val="en-US" w:bidi="en-US"/>
+              </w:rPr>
+              <w:t xml:space="preserve">Air Conditioner </w:t>
+            </w:r>
+            <w:r>
+              <w:rPr>
+                <w:rFonts w:ascii="Aptos" w:hAnsi="Aptos" w:cs="Arial"/>
+                <w:rtl/>
+                <w:lang w:val="ar-SA" w:bidi="ar-SA"/>
+              </w:rPr>
+              <w:t xml:space="preserve">يوم </w:t>
+            </w:r>
+            <w:r>
+              <w:rPr>
+                <w:rFonts w:ascii="Aptos" w:hAnsi="Aptos" w:cs="Arial"/>
+                <w:lang w:val="en-US" w:bidi="en-US"/>
+              </w:rPr>
+              <w:t xml:space="preserve">2026-10-04.</w:t>
             </w:r>
           </w:p>
         </w:tc>
@@ -307,7 +329,37 @@
           <w:rtl/>
           <w:lang w:val="ar-SA" w:bidi="ar-SA"/>
         </w:rPr>
-        <w:t xml:space="preserve">• تمت مراجعة الخطة.</w:t>
+        <w:t xml:space="preserve">• تمت مراجعة </w:t>
+      </w:r>
+      <w:r>
+        <w:rPr>
+          <w:rFonts w:ascii="Aptos" w:hAnsi="Aptos" w:cs="Arial"/>
+          <w:lang w:val="en-US" w:bidi="en-US"/>
+        </w:rPr>
+        <w:t xml:space="preserve">API </w:t>
+      </w:r>
+      <w:r>
+        <w:rPr>
+          <w:rFonts w:ascii="Aptos" w:hAnsi="Aptos" w:cs="Arial"/>
+          <w:rtl/>
+          <w:lang w:val="ar-SA" w:bidi="ar-SA"/>
+        </w:rPr>
+        <w:t xml:space="preserve">و </w:t>
+      </w:r>
+      <w:r>
+        <w:rPr>
+          <w:rFonts w:ascii="Aptos" w:hAnsi="Aptos" w:cs="Arial"/>
+          <w:lang w:val="en-US" w:bidi="en-US"/>
+        </w:rPr>
+        <w:t xml:space="preserve">Air Conditioner </w:t>
+      </w:r>
+      <w:r>
+        <w:rPr>
+          <w:rFonts w:ascii="Aptos" w:hAnsi="Aptos" w:cs="Arial"/>
+          <w:rtl/>
+          <w:lang w:val="ar-SA" w:bidi="ar-SA"/>
+        </w:rPr>
+        <w:t xml:space="preserve">ضمن الخطة.</w:t>
       </w:r>
     </w:p>
     <w:p>
@@ -332,7 +384,7 @@
           <w:color w:val="667085"/>
           <w:lang w:val="en-US" w:bidi="en-US"/>
         </w:rPr>
-        <w:t xml:space="preserve">00:00:52</w:t>
+        <w:t xml:space="preserve">00:00:52 • Dr.Hussain</w:t>
       </w:r>
     </w:p>
     <w:p>
@@ -386,6 +438,182 @@
         <w:t xml:space="preserve">القرارات</w:t>
       </w:r>
     </w:p>
+    <w:tbl>
+      <w:tblPr>
+        <w:bidiVisual/>
+        <w:tblW w:w="5000" w:type="pct"/>
+        <w:tblBorders>
+          <w:top w:val="single" w:color="D7DEE8" w:sz="4"/>
+          <w:left w:val="single" w:color="D7DEE8" w:sz="4"/>
+          <w:bottom w:val="single" w:color="D7DEE8" w:sz="4"/>
+          <w:right w:val="single" w:color="D7DEE8" w:sz="4"/>
+          <w:insideH w:val="single" w:color="D7DEE8" w:sz="3"/>
+          <w:insideV w:val="single" w:color="D7DEE8" w:sz="3"/>
+        </w:tblBorders>
+      </w:tblPr>
+      <w:tblGrid>
+        <w:gridCol/>
+        <w:gridCol/>
+        <w:gridCol/>
+      </w:tblGrid>
+      <w:tr>
+        <w:tc>
+          <w:tcPr>
+            <w:shd w:val="clear" w:fill="132238"/>
+          </w:tcPr>
+          <w:p>
+            <w:pPr>
+              <w:pStyle w:val="TableHeader"/>
+              <w:bidi/>
+              <w:spacing w:before="0" w:after="70" w:line="300" w:lineRule="auto"/>
+              <w:jc w:val="center"/>
+            </w:pPr>
+            <w:r>
+              <w:rPr>
+                <w:rFonts w:ascii="Aptos" w:hAnsi="Aptos" w:cs="Arial"/>
+                <w:color w:val="FFFFFF"/>
+                <w:rtl/>
+                <w:lang w:val="ar-SA" w:bidi="ar-SA"/>
+              </w:rPr>
+              <w:t xml:space="preserve">القرار</w:t>
+            </w:r>
+          </w:p>
+        </w:tc>
+        <w:tc>
+          <w:tcPr>
+            <w:shd w:val="clear" w:fill="132238"/>
+          </w:tcPr>
+          <w:p>
+            <w:pPr>
+              <w:pStyle w:val="TableHeader"/>
+              <w:bidi/>
+              <w:spacing w:before="0" w:after="70" w:line="300" w:lineRule="auto"/>
+              <w:jc w:val="center"/>
+            </w:pPr>
+            <w:r>
+              <w:rPr>
+                <w:rFonts w:ascii="Aptos" w:hAnsi="Aptos" w:cs="Arial"/>
+                <w:color w:val="FFFFFF"/>
+                <w:rtl/>
+                <w:lang w:val="ar-SA" w:bidi="ar-SA"/>
+              </w:rPr>
+              <w:t xml:space="preserve">المسؤول / المعتمد</w:t>
+            </w:r>
+          </w:p>
+        </w:tc>
+        <w:tc>
+          <w:tcPr>
+            <w:shd w:val="clear" w:fill="132238"/>
+          </w:tcPr>
+          <w:p>
+            <w:pPr>
+              <w:pStyle w:val="TableHeader"/>
+              <w:bidi/>
+              <w:spacing w:before="0" w:after="70" w:line="300" w:lineRule="auto"/>
+              <w:jc w:val="center"/>
+            </w:pPr>
+            <w:r>
+              <w:rPr>
+                <w:rFonts w:ascii="Aptos" w:hAnsi="Aptos" w:cs="Arial"/>
+                <w:color w:val="FFFFFF"/>
+                <w:rtl/>
+                <w:lang w:val="ar-SA" w:bidi="ar-SA"/>
+              </w:rPr>
+              <w:t xml:space="preserve">الدليل</w:t>
+            </w:r>
+          </w:p>
+        </w:tc>
+      </w:tr>
+      <w:tr>
+        <w:tc>
+          <w:tcPr/>
+          <w:p>
+            <w:pPr>
+              <w:pStyle w:val="TableCell"/>
+              <w:bidi/>
+              <w:spacing w:before="0" w:after="70" w:line="300" w:lineRule="auto"/>
+              <w:jc w:val="start"/>
+            </w:pPr>
+            <w:r>
+              <w:rPr>
+                <w:rFonts w:ascii="Aptos" w:hAnsi="Aptos" w:cs="Arial"/>
+                <w:rtl/>
+                <w:lang w:val="ar-SA" w:bidi="ar-SA"/>
+              </w:rPr>
+              <w:t xml:space="preserve">تبدأ المراجعة عند </w:t>
+            </w:r>
+            <w:r>
+              <w:rPr>
+                <w:rFonts w:ascii="Aptos" w:hAnsi="Aptos" w:cs="Arial"/>
+                <w:lang w:val="en-US" w:bidi="en-US"/>
+              </w:rPr>
+              <w:t xml:space="preserve">00:00:52.</w:t>
+            </w:r>
+          </w:p>
+        </w:tc>
+        <w:tc>
+          <w:tcPr/>
+          <w:p>
+            <w:pPr>
+              <w:pStyle w:val="TableCell"/>
+              <w:bidi/>
+              <w:spacing w:before="0" w:after="70" w:line="300" w:lineRule="auto"/>
+              <w:jc w:val="start"/>
+            </w:pPr>
+            <w:r>
+              <w:rPr>
+                <w:rFonts w:ascii="Aptos" w:hAnsi="Aptos" w:cs="Arial"/>
+                <w:lang w:val="en-US" w:bidi="en-US"/>
+              </w:rPr>
+              <w:t xml:space="preserve">—</w:t>
+            </w:r>
+          </w:p>
+        </w:tc>
+        <w:tc>
+          <w:tcPr/>
+          <w:p>
+            <w:pPr>
+              <w:pStyle w:val="TableCell"/>
+              <w:bidi/>
+              <w:spacing w:before="0" w:after="70" w:line="300" w:lineRule="auto"/>
+              <w:jc w:val="start"/>
+            </w:pPr>
+            <w:r>
+              <w:rPr>
+                <w:rFonts w:ascii="Aptos" w:hAnsi="Aptos" w:cs="Arial"/>
+                <w:rtl/>
+                <w:lang w:val="ar-SA" w:bidi="ar-SA"/>
+              </w:rPr>
+              <w:t xml:space="preserve">الدليل: </w:t>
+            </w:r>
+            <w:r>
+              <w:rPr>
+                <w:rFonts w:ascii="Aptos" w:hAnsi="Aptos" w:cs="Arial"/>
+                <w:lang w:val="en-US" w:bidi="en-US"/>
+              </w:rPr>
+              <w:t xml:space="preserve">00:00:52 • Dr.Hussain</w:t>
+            </w:r>
+          </w:p>
+        </w:tc>
+      </w:tr>
+    </w:tbl>
+    <w:p>
+      <w:pPr>
+        <w:pStyle w:val="SectionHeading"/>
+        <w:bidi/>
+        <w:spacing w:before="280" w:after="110" w:line="300" w:lineRule="auto"/>
+        <w:jc w:val="start"/>
+      </w:pPr>
+      <w:r>
+        <w:rPr>
+          <w:rFonts w:ascii="Aptos" w:hAnsi="Aptos" w:cs="Arial"/>
+          <w:color w:val="132238"/>
+          <w:rtl/>
+          <w:lang w:val="ar-SA" w:bidi="ar-SA"/>
+        </w:rPr>
+        <w:t xml:space="preserve">المهام والخطوات التالية</w:t>
+      </w:r>
+    </w:p>
     <w:p>
       <w:pPr>
         <w:pStyle w:val="EvidenceText"/>
@@ -417,7 +645,7 @@
           <w:rtl/>
           <w:lang w:val="ar-SA" w:bidi="ar-SA"/>
         </w:rPr>
-        <w:t xml:space="preserve">المهام والخطوات التالية</w:t>
+        <w:t xml:space="preserve">الالتزامات والمواعيد</w:t>
       </w:r>
     </w:p>
     <w:p>
@@ -451,7 +679,7 @@
           <w:rtl/>
           <w:lang w:val="ar-SA" w:bidi="ar-SA"/>
         </w:rPr>
-        <w:t xml:space="preserve">الالتزامات والمواعيد</w:t>
+        <w:t xml:space="preserve">المخاطر والملاحظات</w:t>
       </w:r>
     </w:p>
     <w:p>
@@ -485,7 +713,7 @@
           <w:rtl/>
           <w:lang w:val="ar-SA" w:bidi="ar-SA"/>
         </w:rPr>
-        <w:t xml:space="preserve">المخاطر والملاحظات</w:t>
+        <w:t xml:space="preserve">الأسئلة والنقاط المفتوحة</w:t>
       </w:r>
     </w:p>
     <w:p>
@@ -519,7 +747,7 @@
           <w:rtl/>
           <w:lang w:val="ar-SA" w:bidi="ar-SA"/>
         </w:rPr>
-        <w:t xml:space="preserve">الأسئلة والنقاط المفتوحة</w:t>
+        <w:t xml:space="preserve">اللحظات المهمة</w:t>
       </w:r>
     </w:p>
     <w:p>
@@ -553,7 +781,7 @@
           <w:rtl/>
           <w:lang w:val="ar-SA" w:bidi="ar-SA"/>
         </w:rPr>
-        <w:t xml:space="preserve">اللحظات المهمة</w:t>
+        <w:t xml:space="preserve">مساهمات المشاركين</w:t>
       </w:r>
     </w:p>
     <w:p>
@@ -587,7 +815,7 @@
           <w:rtl/>
           <w:lang w:val="ar-SA" w:bidi="ar-SA"/>
         </w:rPr>
-        <w:t xml:space="preserve">مساهمات المشاركين</w:t>
+        <w:t xml:space="preserve">المتابعة القادمة</w:t>
       </w:r>
     </w:p>
     <w:p>
@@ -621,7 +849,7 @@
           <w:rtl/>
           <w:lang w:val="ar-SA" w:bidi="ar-SA"/>
         </w:rPr>
-        <w:t xml:space="preserve">المتابعة القادمة</w:t>
+        <w:t xml:space="preserve">ملحق الأدلة</w:t>
       </w:r>
     </w:p>
     <w:p>
@@ -635,43 +863,9 @@
         <w:rPr>
           <w:rFonts w:ascii="Aptos" w:hAnsi="Aptos" w:cs="Arial"/>
           <w:color w:val="667085"/>
-          <w:rtl/>
-          <w:lang w:val="ar-SA" w:bidi="ar-SA"/>
-        </w:rPr>
-        <w:t xml:space="preserve">لا توجد عناصر مؤكدة في هذا القسم.</w:t>
-      </w:r>
-    </w:p>
-    <w:p>
-      <w:pPr>
-        <w:pStyle w:val="SectionHeading"/>
-        <w:bidi/>
-        <w:spacing w:before="280" w:after="110" w:line="300" w:lineRule="auto"/>
-        <w:jc w:val="start"/>
-      </w:pPr>
-      <w:r>
-        <w:rPr>
-          <w:rFonts w:ascii="Aptos" w:hAnsi="Aptos" w:cs="Arial"/>
-          <w:color w:val="132238"/>
-          <w:rtl/>
-          <w:lang w:val="ar-SA" w:bidi="ar-SA"/>
-        </w:rPr>
-        <w:t xml:space="preserve">ملحق الأدلة</w:t>
-      </w:r>
-    </w:p>
-    <w:p>
-      <w:pPr>
-        <w:pStyle w:val="EvidenceText"/>
-        <w:bidi/>
-        <w:spacing w:before="0" w:after="70" w:line="300" w:lineRule="auto"/>
-        <w:jc w:val="start"/>
-      </w:pPr>
-      <w:r>
-        <w:rPr>
-          <w:rFonts w:ascii="Aptos" w:hAnsi="Aptos" w:cs="Arial"/>
-          <w:color w:val="667085"/>
           <w:lang w:val="en-US" w:bidi="en-US"/>
         </w:rPr>
-        <w:t xml:space="preserve">00:00:52</w:t>
+        <w:t xml:space="preserve">00:00:52 • Dr.Hussain</w:t>
       </w:r>
     </w:p>
     <w:p>
@@ -687,22 +881,14 @@
           <w:rtl/>
           <w:lang w:val="ar-SA" w:bidi="ar-SA"/>
         </w:rPr>
-        <w:t xml:space="preserve">تمت مراجعة </w:t>
+        <w:t xml:space="preserve">تم تأكيد الموعد في </w:t>
       </w:r>
       <w:r>
         <w:rPr>
           <w:rFonts w:ascii="Aptos" w:hAnsi="Aptos" w:cs="Arial"/>
           <w:lang w:val="en-US" w:bidi="en-US"/>
         </w:rPr>
-        <w:t xml:space="preserve">API </w:t>
-      </w:r>
-      <w:r>
-        <w:rPr>
-          <w:rFonts w:ascii="Aptos" w:hAnsi="Aptos" w:cs="Arial"/>
-          <w:rtl/>
-          <w:lang w:val="ar-SA" w:bidi="ar-SA"/>
-        </w:rPr>
-        <w:t xml:space="preserve">ضمن الخطة.</w:t>
+        <w:t xml:space="preserve">00:00:52.</w:t>
       </w:r>
     </w:p>
     <w:p>
@@ -735,7 +921,7 @@
           <w:color w:val="667085"/>
           <w:lang w:val="en-US" w:bidi="en-US"/>
         </w:rPr>
-        <w:t xml:space="preserve">Archestro Meeting Vault • 2026-10-05 12:29</w:t>
+        <w:t xml:space="preserve">Archestro Meeting Vault • 2026-10-05 22:39</w:t>
       </w:r>
     </w:p>
     <w:sectPr>

</xml_diff>